<commit_message>
Điền dữ liệu mẫu cho 2 chỗ trống còn lại trong thuyết minh đề xuất cấp độ
Ví dụ tổn hại: lộ DLCN của 150.000 khách hàng (khớp quy mô CRM Online mẫu), gián đoạn 24 giờ
(khớp ngưỡng mức M1 trong quy trình ứng phó sự cố).

Co-Authored-By: Claude Opus 5.5 <noreply@anthropic.com>
Claude-Session: https://claude.ai/code/session_01EYfrLZFALxho7iwpK7bTVa
</commit_message>
<xml_diff>
--- a/word/02-ho-so-cap-do/thuyet-minh-de-xuat-cap-do.docx
+++ b/word/02-ho-so-cap-do/thuyet-minh-de-xuat-cap-do.docx
@@ -3445,11 +3445,11 @@
         <w:tblLayout w:type="autofit"/>
       </w:tblPr>
       <w:tblGrid>
-        <w:gridCol w:w="2266"/>
-        <w:gridCol w:w="2322"/>
+        <w:gridCol w:w="2274"/>
+        <w:gridCol w:w="2305"/>
         <w:gridCol w:w="830"/>
-        <w:gridCol w:w="2317"/>
-        <w:gridCol w:w="1290"/>
+        <w:gridCol w:w="2325"/>
+        <w:gridCol w:w="1291"/>
       </w:tblGrid>
       <w:tr>
         <w:trPr>
@@ -3458,7 +3458,7 @@
         </w:trPr>
         <w:tc>
           <w:tcPr>
-            <w:tcW w:type="dxa" w:w="2266"/>
+            <w:tcW w:type="dxa" w:w="2274"/>
             <w:tcBorders>
               <w:top w:val="single" w:color="000000" w:sz="4"/>
               <w:left w:val="single" w:color="000000" w:sz="4"/>
@@ -3495,7 +3495,7 @@
         </w:tc>
         <w:tc>
           <w:tcPr>
-            <w:tcW w:type="dxa" w:w="2322"/>
+            <w:tcW w:type="dxa" w:w="2305"/>
             <w:tcBorders>
               <w:top w:val="single" w:color="000000" w:sz="4"/>
               <w:left w:val="single" w:color="000000" w:sz="4"/>
@@ -3569,7 +3569,7 @@
         </w:tc>
         <w:tc>
           <w:tcPr>
-            <w:tcW w:type="dxa" w:w="2317"/>
+            <w:tcW w:type="dxa" w:w="2325"/>
             <w:tcBorders>
               <w:top w:val="single" w:color="000000" w:sz="4"/>
               <w:left w:val="single" w:color="000000" w:sz="4"/>
@@ -3606,7 +3606,7 @@
         </w:tc>
         <w:tc>
           <w:tcPr>
-            <w:tcW w:type="dxa" w:w="1290"/>
+            <w:tcW w:type="dxa" w:w="1291"/>
             <w:tcBorders>
               <w:top w:val="single" w:color="000000" w:sz="4"/>
               <w:left w:val="single" w:color="000000" w:sz="4"/>
@@ -3649,7 +3649,7 @@
         </w:trPr>
         <w:tc>
           <w:tcPr>
-            <w:tcW w:type="dxa" w:w="2266"/>
+            <w:tcW w:type="dxa" w:w="2274"/>
             <w:tcBorders>
               <w:top w:val="single" w:color="000000" w:sz="4"/>
               <w:left w:val="single" w:color="000000" w:sz="4"/>
@@ -3685,7 +3685,7 @@
         </w:tc>
         <w:tc>
           <w:tcPr>
-            <w:tcW w:type="dxa" w:w="2322"/>
+            <w:tcW w:type="dxa" w:w="2305"/>
             <w:tcBorders>
               <w:top w:val="single" w:color="000000" w:sz="4"/>
               <w:left w:val="single" w:color="000000" w:sz="4"/>
@@ -3728,7 +3728,7 @@
                 <w:szCs w:val="22"/>
                 <w:highlight w:val="yellow"/>
               </w:rPr>
-              <w:t xml:space="preserve">{{N}}</w:t>
+              <w:t xml:space="preserve">150.000</w:t>
             </w:r>
             <w:r>
               <w:rPr>
@@ -3770,7 +3770,7 @@
         </w:tc>
         <w:tc>
           <w:tcPr>
-            <w:tcW w:type="dxa" w:w="2317"/>
+            <w:tcW w:type="dxa" w:w="2325"/>
             <w:tcBorders>
               <w:top w:val="single" w:color="000000" w:sz="4"/>
               <w:left w:val="single" w:color="000000" w:sz="4"/>
@@ -3806,7 +3806,7 @@
         </w:tc>
         <w:tc>
           <w:tcPr>
-            <w:tcW w:type="dxa" w:w="1290"/>
+            <w:tcW w:type="dxa" w:w="1291"/>
             <w:tcBorders>
               <w:top w:val="single" w:color="000000" w:sz="4"/>
               <w:left w:val="single" w:color="000000" w:sz="4"/>
@@ -3848,7 +3848,7 @@
         </w:trPr>
         <w:tc>
           <w:tcPr>
-            <w:tcW w:type="dxa" w:w="2266"/>
+            <w:tcW w:type="dxa" w:w="2274"/>
             <w:tcBorders>
               <w:top w:val="single" w:color="000000" w:sz="4"/>
               <w:left w:val="single" w:color="000000" w:sz="4"/>
@@ -3884,7 +3884,7 @@
         </w:tc>
         <w:tc>
           <w:tcPr>
-            <w:tcW w:type="dxa" w:w="2322"/>
+            <w:tcW w:type="dxa" w:w="2305"/>
             <w:tcBorders>
               <w:top w:val="single" w:color="000000" w:sz="4"/>
               <w:left w:val="single" w:color="000000" w:sz="4"/>
@@ -3927,7 +3927,7 @@
                 <w:szCs w:val="22"/>
                 <w:highlight w:val="yellow"/>
               </w:rPr>
-              <w:t xml:space="preserve">{{X}}</w:t>
+              <w:t xml:space="preserve">24</w:t>
             </w:r>
             <w:r>
               <w:rPr>
@@ -3969,7 +3969,7 @@
         </w:tc>
         <w:tc>
           <w:tcPr>
-            <w:tcW w:type="dxa" w:w="2317"/>
+            <w:tcW w:type="dxa" w:w="2325"/>
             <w:tcBorders>
               <w:top w:val="single" w:color="000000" w:sz="4"/>
               <w:left w:val="single" w:color="000000" w:sz="4"/>
@@ -4005,7 +4005,7 @@
         </w:tc>
         <w:tc>
           <w:tcPr>
-            <w:tcW w:type="dxa" w:w="1290"/>
+            <w:tcW w:type="dxa" w:w="1291"/>
             <w:tcBorders>
               <w:top w:val="single" w:color="000000" w:sz="4"/>
               <w:left w:val="single" w:color="000000" w:sz="4"/>
@@ -4047,7 +4047,7 @@
         </w:trPr>
         <w:tc>
           <w:tcPr>
-            <w:tcW w:type="dxa" w:w="2266"/>
+            <w:tcW w:type="dxa" w:w="2274"/>
             <w:tcBorders>
               <w:top w:val="single" w:color="000000" w:sz="4"/>
               <w:left w:val="single" w:color="000000" w:sz="4"/>
@@ -4083,7 +4083,7 @@
         </w:tc>
         <w:tc>
           <w:tcPr>
-            <w:tcW w:type="dxa" w:w="2322"/>
+            <w:tcW w:type="dxa" w:w="2305"/>
             <w:tcBorders>
               <w:top w:val="single" w:color="000000" w:sz="4"/>
               <w:left w:val="single" w:color="000000" w:sz="4"/>
@@ -4131,7 +4131,7 @@
         </w:tc>
         <w:tc>
           <w:tcPr>
-            <w:tcW w:type="dxa" w:w="2317"/>
+            <w:tcW w:type="dxa" w:w="2325"/>
             <w:tcBorders>
               <w:top w:val="single" w:color="000000" w:sz="4"/>
               <w:left w:val="single" w:color="000000" w:sz="4"/>
@@ -4167,7 +4167,7 @@
         </w:tc>
         <w:tc>
           <w:tcPr>
-            <w:tcW w:type="dxa" w:w="1290"/>
+            <w:tcW w:type="dxa" w:w="1291"/>
             <w:tcBorders>
               <w:top w:val="single" w:color="000000" w:sz="4"/>
               <w:left w:val="single" w:color="000000" w:sz="4"/>
@@ -4209,7 +4209,7 @@
         </w:trPr>
         <w:tc>
           <w:tcPr>
-            <w:tcW w:type="dxa" w:w="2266"/>
+            <w:tcW w:type="dxa" w:w="2274"/>
             <w:tcBorders>
               <w:top w:val="single" w:color="000000" w:sz="4"/>
               <w:left w:val="single" w:color="000000" w:sz="4"/>
@@ -4245,7 +4245,7 @@
         </w:tc>
         <w:tc>
           <w:tcPr>
-            <w:tcW w:type="dxa" w:w="2322"/>
+            <w:tcW w:type="dxa" w:w="2305"/>
             <w:tcBorders>
               <w:top w:val="single" w:color="000000" w:sz="4"/>
               <w:left w:val="single" w:color="000000" w:sz="4"/>
@@ -4293,7 +4293,7 @@
         </w:tc>
         <w:tc>
           <w:tcPr>
-            <w:tcW w:type="dxa" w:w="2317"/>
+            <w:tcW w:type="dxa" w:w="2325"/>
             <w:tcBorders>
               <w:top w:val="single" w:color="000000" w:sz="4"/>
               <w:left w:val="single" w:color="000000" w:sz="4"/>
@@ -4329,7 +4329,7 @@
         </w:tc>
         <w:tc>
           <w:tcPr>
-            <w:tcW w:type="dxa" w:w="1290"/>
+            <w:tcW w:type="dxa" w:w="1291"/>
             <w:tcBorders>
               <w:top w:val="single" w:color="000000" w:sz="4"/>
               <w:left w:val="single" w:color="000000" w:sz="4"/>

</xml_diff>